<commit_message>
Clarify W5-W18 course flow and synchronize classroom downloads
</commit_message>
<xml_diff>
--- a/worksheets/W8_立場光譜活動卡_教師印用.docx
+++ b/worksheets/W8_立場光譜活動卡_教師印用.docx
@@ -527,7 +527,7 @@
       </w:tblGrid>
       <w:tr>
         <w:trPr>
-          <w:trHeight w:val="454" w:hRule="atLeast"/>
+          <w:trHeight w:val="510" w:hRule="atLeast"/>
         </w:trPr>
         <w:tc>
           <w:tcPr>
@@ -557,7 +557,7 @@
       </w:tr>
       <w:tr>
         <w:trPr>
-          <w:trHeight w:val="454" w:hRule="atLeast"/>
+          <w:trHeight w:val="510" w:hRule="atLeast"/>
         </w:trPr>
         <w:tc>
           <w:tcPr>
@@ -667,7 +667,7 @@
       </w:tblGrid>
       <w:tr>
         <w:trPr>
-          <w:trHeight w:val="454" w:hRule="atLeast"/>
+          <w:trHeight w:val="510" w:hRule="atLeast"/>
         </w:trPr>
         <w:tc>
           <w:tcPr>
@@ -697,7 +697,7 @@
       </w:tr>
       <w:tr>
         <w:trPr>
-          <w:trHeight w:val="454" w:hRule="atLeast"/>
+          <w:trHeight w:val="510" w:hRule="atLeast"/>
         </w:trPr>
         <w:tc>
           <w:tcPr>
@@ -807,7 +807,7 @@
       </w:tblGrid>
       <w:tr>
         <w:trPr>
-          <w:trHeight w:val="454" w:hRule="atLeast"/>
+          <w:trHeight w:val="510" w:hRule="atLeast"/>
         </w:trPr>
         <w:tc>
           <w:tcPr>
@@ -837,7 +837,7 @@
       </w:tr>
       <w:tr>
         <w:trPr>
-          <w:trHeight w:val="454" w:hRule="atLeast"/>
+          <w:trHeight w:val="510" w:hRule="atLeast"/>
         </w:trPr>
         <w:tc>
           <w:tcPr>
@@ -947,7 +947,7 @@
       </w:tblGrid>
       <w:tr>
         <w:trPr>
-          <w:trHeight w:val="454" w:hRule="atLeast"/>
+          <w:trHeight w:val="510" w:hRule="atLeast"/>
         </w:trPr>
         <w:tc>
           <w:tcPr>
@@ -977,7 +977,7 @@
       </w:tr>
       <w:tr>
         <w:trPr>
-          <w:trHeight w:val="454" w:hRule="atLeast"/>
+          <w:trHeight w:val="510" w:hRule="atLeast"/>
         </w:trPr>
         <w:tc>
           <w:tcPr>

</xml_diff>